<commit_message>
Rebuild WRITEUP.docx in place; drop alternate
</commit_message>
<xml_diff>
--- a/WRITEUP.docx
+++ b/WRITEUP.docx
@@ -282,7 +282,39 @@
         <w:rPr>
           <w:color w:val="0E2E5C"/>
         </w:rPr>
-        <w:t>2 · Headline result</w:t>
+        <w:t>2 · Headline result — v1 vs v2, actually run</w:t>
+      </w:r>
+    </w:p>
+    <w:p>
+      <w:r>
+        <w:rPr>
+          <w:b/>
+        </w:rPr>
+        <w:t>v1 was tested.</w:t>
+      </w:r>
+      <w:r>
+        <w:t xml:space="preserve"> The literal starter prompt from the brief was run through the same eval harness as v2 on 15 scripted scenarios (the v1 scenario set, kept fixed since the first eval). Results in </w:t>
+      </w:r>
+      <w:r>
+        <w:rPr>
+          <w:rFonts w:ascii="Consolas" w:hAnsi="Consolas"/>
+          <w:sz w:val="19"/>
+        </w:rPr>
+        <w:t>collections-voicebot/eval/results_v1.csv</w:t>
+      </w:r>
+      <w:r>
+        <w:t>. v2 was then run on the same 15 scenarios for an apples-to-apples comparison, and separately on the full 42-scenario stress suite for the production picture.</w:t>
+      </w:r>
+    </w:p>
+    <w:p>
+      <w:pPr>
+        <w:pStyle w:val="Heading4"/>
+      </w:pPr>
+      <w:r>
+        <w:rPr>
+          <w:color w:val="0E2E5C"/>
+        </w:rPr>
+        <w:t>Apples-to-apples: v1 vs v2 on the same 15 scenarios</w:t>
       </w:r>
     </w:p>
     <w:tbl>
@@ -351,7 +383,7 @@
                 <w:b/>
                 <w:sz w:val="19"/>
               </w:rPr>
-              <w:t>v2 (pre-layers)</w:t>
+              <w:t>v2 final</w:t>
             </w:r>
           </w:p>
         </w:tc>
@@ -370,7 +402,7 @@
                 <w:b/>
                 <w:sz w:val="19"/>
               </w:rPr>
-              <w:t>v2 (final)</w:t>
+              <w:t>Delta</w:t>
             </w:r>
           </w:p>
         </w:tc>
@@ -388,10 +420,9 @@
             </w:r>
             <w:r>
               <w:rPr>
-                <w:b/>
-                <w:sz w:val="19"/>
-              </w:rPr>
-              <w:t>P0 (zero-tolerance) compliance</w:t>
+                <w:sz w:val="19"/>
+              </w:rPr>
+              <w:t>Calls with zero policy violations</w:t>
             </w:r>
           </w:p>
         </w:tc>
@@ -407,6 +438,7 @@
             </w:r>
             <w:r>
               <w:rPr>
+                <w:b/>
                 <w:sz w:val="19"/>
               </w:rPr>
               <w:t>13%</w:t>
@@ -425,9 +457,10 @@
             </w:r>
             <w:r>
               <w:rPr>
-                <w:sz w:val="19"/>
-              </w:rPr>
-              <w:t>94%</w:t>
+                <w:b/>
+                <w:sz w:val="19"/>
+              </w:rPr>
+              <w:t>100%</w:t>
             </w:r>
           </w:p>
         </w:tc>
@@ -443,16 +476,9 @@
             </w:r>
             <w:r>
               <w:rPr>
-                <w:b/>
-                <w:sz w:val="19"/>
-              </w:rPr>
-              <w:t>100%</w:t>
-            </w:r>
-            <w:r>
-              <w:rPr>
-                <w:sz w:val="19"/>
-              </w:rPr>
-              <w:t xml:space="preserve"> ✓</w:t>
+                <w:sz w:val="19"/>
+              </w:rPr>
+              <w:t>+87 pp</w:t>
             </w:r>
           </w:p>
         </w:tc>
@@ -472,7 +498,7 @@
               <w:rPr>
                 <w:sz w:val="19"/>
               </w:rPr>
-              <w:t>Calls with zero policy violations</w:t>
+              <w:t>Right tone for segment</w:t>
             </w:r>
           </w:p>
         </w:tc>
@@ -490,7 +516,7 @@
               <w:rPr>
                 <w:sz w:val="19"/>
               </w:rPr>
-              <w:t>13%</w:t>
+              <w:t>87%</w:t>
             </w:r>
           </w:p>
         </w:tc>
@@ -508,7 +534,7 @@
               <w:rPr>
                 <w:sz w:val="19"/>
               </w:rPr>
-              <w:t>93%</w:t>
+              <w:t>100%</w:t>
             </w:r>
           </w:p>
         </w:tc>
@@ -524,16 +550,9 @@
             </w:r>
             <w:r>
               <w:rPr>
-                <w:b/>
-                <w:sz w:val="19"/>
-              </w:rPr>
-              <w:t>95%</w:t>
-            </w:r>
-            <w:r>
-              <w:rPr>
-                <w:sz w:val="19"/>
-              </w:rPr>
-              <w:t xml:space="preserve"> ✓</w:t>
+                <w:sz w:val="19"/>
+              </w:rPr>
+              <w:t>+13 pp</w:t>
             </w:r>
           </w:p>
         </w:tc>
@@ -551,10 +570,9 @@
             </w:r>
             <w:r>
               <w:rPr>
-                <w:b/>
-                <w:sz w:val="19"/>
-              </w:rPr>
-              <w:t>Of PTPs, date + mode captured</w:t>
+                <w:sz w:val="19"/>
+              </w:rPr>
+              <w:t>Right escalation / transfer decision</w:t>
             </w:r>
           </w:p>
         </w:tc>
@@ -572,7 +590,7 @@
               <w:rPr>
                 <w:sz w:val="19"/>
               </w:rPr>
-              <w:t>low</w:t>
+              <w:t>100%</w:t>
             </w:r>
           </w:p>
         </w:tc>
@@ -590,7 +608,7 @@
               <w:rPr>
                 <w:sz w:val="19"/>
               </w:rPr>
-              <w:t>78%</w:t>
+              <w:t>87%</w:t>
             </w:r>
           </w:p>
         </w:tc>
@@ -606,16 +624,9 @@
             </w:r>
             <w:r>
               <w:rPr>
-                <w:b/>
-                <w:sz w:val="19"/>
-              </w:rPr>
-              <w:t>100%</w:t>
-            </w:r>
-            <w:r>
-              <w:rPr>
-                <w:sz w:val="19"/>
-              </w:rPr>
-              <w:t xml:space="preserve"> ✓</w:t>
+                <w:sz w:val="19"/>
+              </w:rPr>
+              <w:t>−13 pp</w:t>
             </w:r>
           </w:p>
         </w:tc>
@@ -635,7 +646,7 @@
               <w:rPr>
                 <w:sz w:val="19"/>
               </w:rPr>
-              <w:t>Right tone for segment</w:t>
+              <w:t>Outcome matches expected</w:t>
             </w:r>
           </w:p>
         </w:tc>
@@ -653,7 +664,14 @@
               <w:rPr>
                 <w:sz w:val="19"/>
               </w:rPr>
-              <w:t>87% (vacuous)</w:t>
+              <w:t xml:space="preserve">87% </w:t>
+            </w:r>
+            <w:r>
+              <w:rPr>
+                <w:i/>
+                <w:sz w:val="19"/>
+              </w:rPr>
+              <w:t>(see below)</w:t>
             </w:r>
           </w:p>
         </w:tc>
@@ -671,7 +689,14 @@
               <w:rPr>
                 <w:sz w:val="19"/>
               </w:rPr>
-              <w:t>100%</w:t>
+              <w:t xml:space="preserve">67% </w:t>
+            </w:r>
+            <w:r>
+              <w:rPr>
+                <w:i/>
+                <w:sz w:val="19"/>
+              </w:rPr>
+              <w:t>(see below)</w:t>
             </w:r>
           </w:p>
         </w:tc>
@@ -687,16 +712,9 @@
             </w:r>
             <w:r>
               <w:rPr>
-                <w:b/>
-                <w:sz w:val="19"/>
-              </w:rPr>
-              <w:t>100%</w:t>
-            </w:r>
-            <w:r>
-              <w:rPr>
-                <w:sz w:val="19"/>
-              </w:rPr>
-              <w:t xml:space="preserve"> ✓</w:t>
+                <w:sz w:val="19"/>
+              </w:rPr>
+              <w:t>−20 pp</w:t>
             </w:r>
           </w:p>
         </w:tc>
@@ -714,9 +732,10 @@
             </w:r>
             <w:r>
               <w:rPr>
-                <w:sz w:val="19"/>
-              </w:rPr>
-              <w:t>Apex tone preservation</w:t>
+                <w:b/>
+                <w:sz w:val="19"/>
+              </w:rPr>
+              <w:t>Full pass (all 4 axes both honour)</w:t>
             </w:r>
           </w:p>
         </w:tc>
@@ -732,9 +751,10 @@
             </w:r>
             <w:r>
               <w:rPr>
-                <w:sz w:val="19"/>
-              </w:rPr>
-              <w:t>0%</w:t>
+                <w:b/>
+                <w:sz w:val="19"/>
+              </w:rPr>
+              <w:t>13%</w:t>
             </w:r>
           </w:p>
         </w:tc>
@@ -750,9 +770,10 @@
             </w:r>
             <w:r>
               <w:rPr>
-                <w:sz w:val="19"/>
-              </w:rPr>
-              <w:t>100%</w:t>
+                <w:b/>
+                <w:sz w:val="19"/>
+              </w:rPr>
+              <w:t>67%</w:t>
             </w:r>
           </w:p>
         </w:tc>
@@ -771,13 +792,70 @@
                 <w:b/>
                 <w:sz w:val="19"/>
               </w:rPr>
-              <w:t>100%</w:t>
-            </w:r>
-            <w:r>
-              <w:rPr>
-                <w:sz w:val="19"/>
-              </w:rPr>
-              <w:t xml:space="preserve"> ✓</w:t>
+              <w:t>+54 pp</w:t>
+            </w:r>
+          </w:p>
+        </w:tc>
+      </w:tr>
+    </w:tbl>
+    <w:p/>
+    <w:p>
+      <w:pPr>
+        <w:pStyle w:val="Heading4"/>
+      </w:pPr>
+      <w:r>
+        <w:rPr>
+          <w:color w:val="0E2E5C"/>
+        </w:rPr>
+        <w:t>v2 on the full 42-scenario stress suite (adds 11 adversarial + 16 multilingual)</w:t>
+      </w:r>
+    </w:p>
+    <w:tbl>
+      <w:tblPr>
+        <w:tblStyle w:val="LightGrid-Accent1"/>
+        <w:tblW w:type="auto" w:w="0"/>
+        <w:tblLook w:firstColumn="1" w:firstRow="1" w:lastColumn="0" w:lastRow="0" w:noHBand="0" w:noVBand="1" w:val="04A0"/>
+      </w:tblPr>
+      <w:tblGrid>
+        <w:gridCol w:w="4986"/>
+        <w:gridCol w:w="4986"/>
+      </w:tblGrid>
+      <w:tr>
+        <w:tc>
+          <w:tcPr>
+            <w:tcW w:type="dxa" w:w="4986"/>
+          </w:tcPr>
+          <w:p>
+            <w:r>
+              <w:rPr>
+                <w:sz w:val="19"/>
+              </w:rPr>
+            </w:r>
+            <w:r>
+              <w:rPr>
+                <w:b/>
+                <w:sz w:val="19"/>
+              </w:rPr>
+              <w:t>Metric</w:t>
+            </w:r>
+          </w:p>
+        </w:tc>
+        <w:tc>
+          <w:tcPr>
+            <w:tcW w:type="dxa" w:w="4986"/>
+          </w:tcPr>
+          <w:p>
+            <w:r>
+              <w:rPr>
+                <w:sz w:val="19"/>
+              </w:rPr>
+            </w:r>
+            <w:r>
+              <w:rPr>
+                <w:b/>
+                <w:sz w:val="19"/>
+              </w:rPr>
+              <w:t>v2</w:t>
             </w:r>
           </w:p>
         </w:tc>
@@ -785,7 +863,7 @@
       <w:tr>
         <w:tc>
           <w:tcPr>
-            <w:tcW w:type="dxa" w:w="2493"/>
+            <w:tcW w:type="dxa" w:w="4986"/>
           </w:tcPr>
           <w:p>
             <w:r>
@@ -797,13 +875,13 @@
               <w:rPr>
                 <w:sz w:val="19"/>
               </w:rPr>
-              <w:t>Calls that would pass full QA</w:t>
+              <w:t>P0 (zero-tolerance) compliance</w:t>
             </w:r>
           </w:p>
         </w:tc>
         <w:tc>
           <w:tcPr>
-            <w:tcW w:type="dxa" w:w="2493"/>
+            <w:tcW w:type="dxa" w:w="4986"/>
           </w:tcPr>
           <w:p>
             <w:r>
@@ -813,46 +891,16 @@
             </w:r>
             <w:r>
               <w:rPr>
-                <w:sz w:val="19"/>
-              </w:rPr>
-              <w:t>13%</w:t>
-            </w:r>
-          </w:p>
-        </w:tc>
-        <w:tc>
-          <w:tcPr>
-            <w:tcW w:type="dxa" w:w="2493"/>
-          </w:tcPr>
-          <w:p>
-            <w:r>
-              <w:rPr>
-                <w:sz w:val="19"/>
-              </w:rPr>
-            </w:r>
-            <w:r>
-              <w:rPr>
-                <w:sz w:val="19"/>
-              </w:rPr>
-              <w:t>60%</w:t>
-            </w:r>
-          </w:p>
-        </w:tc>
-        <w:tc>
-          <w:tcPr>
-            <w:tcW w:type="dxa" w:w="2493"/>
-          </w:tcPr>
-          <w:p>
-            <w:r>
-              <w:rPr>
-                <w:sz w:val="19"/>
-              </w:rPr>
-            </w:r>
-            <w:r>
-              <w:rPr>
                 <w:b/>
                 <w:sz w:val="19"/>
               </w:rPr>
-              <w:t>55%</w:t>
+              <w:t>100%</w:t>
+            </w:r>
+            <w:r>
+              <w:rPr>
+                <w:sz w:val="19"/>
+              </w:rPr>
+              <w:t xml:space="preserve"> ✓</w:t>
             </w:r>
           </w:p>
         </w:tc>
@@ -860,7 +908,7 @@
       <w:tr>
         <w:tc>
           <w:tcPr>
-            <w:tcW w:type="dxa" w:w="2493"/>
+            <w:tcW w:type="dxa" w:w="4986"/>
           </w:tcPr>
           <w:p>
             <w:r>
@@ -872,13 +920,13 @@
               <w:rPr>
                 <w:sz w:val="19"/>
               </w:rPr>
-              <w:t>Estimated voice p95 round-trip</w:t>
+              <w:t>Calls with zero policy violations</w:t>
             </w:r>
           </w:p>
         </w:tc>
         <w:tc>
           <w:tcPr>
-            <w:tcW w:type="dxa" w:w="2493"/>
+            <w:tcW w:type="dxa" w:w="4986"/>
           </w:tcPr>
           <w:p>
             <w:r>
@@ -890,44 +938,7 @@
               <w:rPr>
                 <w:sz w:val="19"/>
               </w:rPr>
-              <w:t>—</w:t>
-            </w:r>
-          </w:p>
-        </w:tc>
-        <w:tc>
-          <w:tcPr>
-            <w:tcW w:type="dxa" w:w="2493"/>
-          </w:tcPr>
-          <w:p>
-            <w:r>
-              <w:rPr>
-                <w:sz w:val="19"/>
-              </w:rPr>
-            </w:r>
-            <w:r>
-              <w:rPr>
-                <w:sz w:val="19"/>
-              </w:rPr>
-              <w:t>2.8 s</w:t>
-            </w:r>
-          </w:p>
-        </w:tc>
-        <w:tc>
-          <w:tcPr>
-            <w:tcW w:type="dxa" w:w="2493"/>
-          </w:tcPr>
-          <w:p>
-            <w:r>
-              <w:rPr>
-                <w:sz w:val="19"/>
-              </w:rPr>
-            </w:r>
-            <w:r>
-              <w:rPr>
-                <w:b/>
-                <w:sz w:val="19"/>
-              </w:rPr>
-              <w:t>1.9 s</w:t>
+              <w:t>95%</w:t>
             </w:r>
           </w:p>
         </w:tc>
@@ -935,7 +946,7 @@
       <w:tr>
         <w:tc>
           <w:tcPr>
-            <w:tcW w:type="dxa" w:w="2493"/>
+            <w:tcW w:type="dxa" w:w="4986"/>
           </w:tcPr>
           <w:p>
             <w:r>
@@ -947,13 +958,13 @@
               <w:rPr>
                 <w:sz w:val="19"/>
               </w:rPr>
-              <w:t>Mean cost per call (LLM + STT + TTS)</w:t>
+              <w:t>Of PTPs, date + mode captured</w:t>
             </w:r>
           </w:p>
         </w:tc>
         <w:tc>
           <w:tcPr>
-            <w:tcW w:type="dxa" w:w="2493"/>
+            <w:tcW w:type="dxa" w:w="4986"/>
           </w:tcPr>
           <w:p>
             <w:r>
@@ -963,15 +974,36 @@
             </w:r>
             <w:r>
               <w:rPr>
-                <w:sz w:val="19"/>
-              </w:rPr>
-              <w:t>—</w:t>
+                <w:b/>
+                <w:sz w:val="19"/>
+              </w:rPr>
+              <w:t>100%</w:t>
+            </w:r>
+          </w:p>
+        </w:tc>
+      </w:tr>
+      <w:tr>
+        <w:tc>
+          <w:tcPr>
+            <w:tcW w:type="dxa" w:w="4986"/>
+          </w:tcPr>
+          <w:p>
+            <w:r>
+              <w:rPr>
+                <w:sz w:val="19"/>
+              </w:rPr>
+            </w:r>
+            <w:r>
+              <w:rPr>
+                <w:sz w:val="19"/>
+              </w:rPr>
+              <w:t>Apex tone preservation</w:t>
             </w:r>
           </w:p>
         </w:tc>
         <w:tc>
           <w:tcPr>
-            <w:tcW w:type="dxa" w:w="2493"/>
+            <w:tcW w:type="dxa" w:w="4986"/>
           </w:tcPr>
           <w:p>
             <w:r>
@@ -983,13 +1015,33 @@
               <w:rPr>
                 <w:sz w:val="19"/>
               </w:rPr>
-              <w:t>₹0.31</w:t>
+              <w:t>100%</w:t>
+            </w:r>
+          </w:p>
+        </w:tc>
+      </w:tr>
+      <w:tr>
+        <w:tc>
+          <w:tcPr>
+            <w:tcW w:type="dxa" w:w="4986"/>
+          </w:tcPr>
+          <w:p>
+            <w:r>
+              <w:rPr>
+                <w:sz w:val="19"/>
+              </w:rPr>
+            </w:r>
+            <w:r>
+              <w:rPr>
+                <w:sz w:val="19"/>
+              </w:rPr>
+              <w:t>Calls that would pass full QA (6 axes)</w:t>
             </w:r>
           </w:p>
         </w:tc>
         <w:tc>
           <w:tcPr>
-            <w:tcW w:type="dxa" w:w="2493"/>
+            <w:tcW w:type="dxa" w:w="4986"/>
           </w:tcPr>
           <w:p>
             <w:r>
@@ -999,7 +1051,82 @@
             </w:r>
             <w:r>
               <w:rPr>
-                <w:b/>
+                <w:sz w:val="19"/>
+              </w:rPr>
+              <w:t>55%</w:t>
+            </w:r>
+          </w:p>
+        </w:tc>
+      </w:tr>
+      <w:tr>
+        <w:tc>
+          <w:tcPr>
+            <w:tcW w:type="dxa" w:w="4986"/>
+          </w:tcPr>
+          <w:p>
+            <w:r>
+              <w:rPr>
+                <w:sz w:val="19"/>
+              </w:rPr>
+            </w:r>
+            <w:r>
+              <w:rPr>
+                <w:sz w:val="19"/>
+              </w:rPr>
+              <w:t>Estimated voice p95 round-trip</w:t>
+            </w:r>
+          </w:p>
+        </w:tc>
+        <w:tc>
+          <w:tcPr>
+            <w:tcW w:type="dxa" w:w="4986"/>
+          </w:tcPr>
+          <w:p>
+            <w:r>
+              <w:rPr>
+                <w:sz w:val="19"/>
+              </w:rPr>
+            </w:r>
+            <w:r>
+              <w:rPr>
+                <w:sz w:val="19"/>
+              </w:rPr>
+              <w:t>1.9 s</w:t>
+            </w:r>
+          </w:p>
+        </w:tc>
+      </w:tr>
+      <w:tr>
+        <w:tc>
+          <w:tcPr>
+            <w:tcW w:type="dxa" w:w="4986"/>
+          </w:tcPr>
+          <w:p>
+            <w:r>
+              <w:rPr>
+                <w:sz w:val="19"/>
+              </w:rPr>
+            </w:r>
+            <w:r>
+              <w:rPr>
+                <w:sz w:val="19"/>
+              </w:rPr>
+              <w:t>Mean cost per call (LLM + STT + TTS)</w:t>
+            </w:r>
+          </w:p>
+        </w:tc>
+        <w:tc>
+          <w:tcPr>
+            <w:tcW w:type="dxa" w:w="4986"/>
+          </w:tcPr>
+          <w:p>
+            <w:r>
+              <w:rPr>
+                <w:sz w:val="19"/>
+              </w:rPr>
+            </w:r>
+            <w:r>
+              <w:rPr>
                 <w:sz w:val="19"/>
               </w:rPr>
               <w:t>₹0.41</w:t>
@@ -1011,16 +1138,142 @@
     <w:p/>
     <w:p>
       <w:r>
-        <w:t xml:space="preserve">Across </w:t>
+        <w:rPr>
+          <w:b/>
+        </w:rPr>
+        <w:t>Why v1 hit 87% outcome_match despite being broken.</w:t>
+      </w:r>
+      <w:r>
+        <w:t xml:space="preserve"> v1 over-promises ("I can approve up to 50% waiver"), mis-states facts ("interest rate is 12%, late fee ₹1500"), and threatens legal action — so customers cheerfully agree to pay, and the structured outcome lands as </w:t>
+      </w:r>
+      <w:r>
+        <w:rPr>
+          <w:rFonts w:ascii="Consolas" w:hAnsi="Consolas"/>
+          <w:sz w:val="19"/>
+        </w:rPr>
+        <w:t>promise_to_pay</w:t>
+      </w:r>
+      <w:r>
+        <w:t xml:space="preserve">. The outcome axis alone makes v1 look competent. The compliance axis is what exposes it: </w:t>
       </w:r>
       <w:r>
         <w:rPr>
           <w:b/>
         </w:rPr>
-        <w:t>42 scenarios</w:t>
+        <w:t>v1 committed 21 policy violations across 15 calls</w:t>
       </w:r>
       <w:r>
-        <w:t xml:space="preserve"> (16 P0, 26 P1) spanning English, Hinglish, Hindi, Tamil, Malayalam. Five eval cycles.</w:t>
+        <w:t xml:space="preserve">, including 5 CIBIL-prediction breaches, 3 wrong-late-fee statements, 2 waiver pre-approvals, 2 legal threats, and 2 distress-signal-ignored events (kept pitching after medical / job loss). Under RBI Fair Practices Code, each of those is a regulatory event. v1's per-bucket compliance: </w:t>
+      </w:r>
+      <w:r>
+        <w:rPr>
+          <w:rFonts w:ascii="Consolas" w:hAnsi="Consolas"/>
+          <w:sz w:val="19"/>
+        </w:rPr>
+        <w:t>compliance 0%</w:t>
+      </w:r>
+      <w:r>
+        <w:t xml:space="preserve">, </w:t>
+      </w:r>
+      <w:r>
+        <w:rPr>
+          <w:rFonts w:ascii="Consolas" w:hAnsi="Consolas"/>
+          <w:sz w:val="19"/>
+        </w:rPr>
+        <w:t>relationship 0%</w:t>
+      </w:r>
+      <w:r>
+        <w:t xml:space="preserve">, </w:t>
+      </w:r>
+      <w:r>
+        <w:rPr>
+          <w:rFonts w:ascii="Consolas" w:hAnsi="Consolas"/>
+          <w:sz w:val="19"/>
+        </w:rPr>
+        <w:t>scope 0%</w:t>
+      </w:r>
+      <w:r>
+        <w:t xml:space="preserve">, </w:t>
+      </w:r>
+      <w:r>
+        <w:rPr>
+          <w:rFonts w:ascii="Consolas" w:hAnsi="Consolas"/>
+          <w:sz w:val="19"/>
+        </w:rPr>
+        <w:t>adherence 17%</w:t>
+      </w:r>
+      <w:r>
+        <w:t xml:space="preserve">, </w:t>
+      </w:r>
+      <w:r>
+        <w:rPr>
+          <w:rFonts w:ascii="Consolas" w:hAnsi="Consolas"/>
+          <w:sz w:val="19"/>
+        </w:rPr>
+        <w:t>factual 50%</w:t>
+      </w:r>
+      <w:r>
+        <w:t>.</w:t>
+      </w:r>
+    </w:p>
+    <w:p>
+      <w:r>
+        <w:rPr>
+          <w:b/>
+        </w:rPr>
+        <w:t>Why v2's outcome_match dropped to 67% on the same set.</w:t>
+      </w:r>
+      <w:r>
+        <w:t xml:space="preserve"> v2 </w:t>
+      </w:r>
+      <w:r>
+        <w:rPr>
+          <w:i/>
+        </w:rPr>
+        <w:t>refuses</w:t>
+      </w:r>
+      <w:r>
+        <w:t xml:space="preserve"> to over-promise. Where v1 cheerfully accepted "I'll pay next month" from a DPD-22 frequent-late, v2's segment policy caps PTP horizon at 7 days and pushes back — which sometimes ends in </w:t>
+      </w:r>
+      <w:r>
+        <w:rPr>
+          <w:rFonts w:ascii="Consolas" w:hAnsi="Consolas"/>
+          <w:sz w:val="19"/>
+        </w:rPr>
+        <w:t>callback_request</w:t>
+      </w:r>
+      <w:r>
+        <w:t xml:space="preserve"> or </w:t>
+      </w:r>
+      <w:r>
+        <w:rPr>
+          <w:rFonts w:ascii="Consolas" w:hAnsi="Consolas"/>
+          <w:sz w:val="19"/>
+        </w:rPr>
+        <w:t>human_callback_required</w:t>
+      </w:r>
+      <w:r>
+        <w:t xml:space="preserve"> rather than the scripted </w:t>
+      </w:r>
+      <w:r>
+        <w:rPr>
+          <w:rFonts w:ascii="Consolas" w:hAnsi="Consolas"/>
+          <w:sz w:val="19"/>
+        </w:rPr>
+        <w:t>promise_to_pay</w:t>
+      </w:r>
+      <w:r>
+        <w:t xml:space="preserve">. The "miss" is correct behaviour. Three of the five outcome-mismatches on the shared set are this pattern; the eval's </w:t>
+      </w:r>
+      <w:r>
+        <w:rPr>
+          <w:rFonts w:ascii="Consolas" w:hAnsi="Consolas"/>
+          <w:sz w:val="19"/>
+        </w:rPr>
+        <w:t>expected_outcome</w:t>
+      </w:r>
+      <w:r>
+        <w:t xml:space="preserve"> was written before segment-policy thresholds existed.</w:t>
       </w:r>
     </w:p>
     <w:p>
@@ -1037,10 +1290,10 @@
         <w:rPr>
           <w:b/>
         </w:rPr>
-        <w:t>moved the ship-blocking floor from 94% to 100% on P0 compliance</w:t>
+        <w:t>moved zero-violation-rate from 13% to 100% on the shared set</w:t>
       </w:r>
       <w:r>
-        <w:t xml:space="preserve"> — the single most important number, because under RBI Fair Practices Code one P0 failure is a regulatory event. The 55% full-pass (vs 60% prior) reflects two judge-strict axes (hallucination, outcome-match) that are </w:t>
+        <w:t xml:space="preserve"> (+87 pp) and held 95% on the full 42-scenario stress suite. 4-axis full-pass went from 13% → 67% (+54 pp) on the shared set. P0 compliance is 100% on the full suite, which under RBI FPC is the single most important number. The 55% full-pass on the 42-scenario suite uses 6 axes (adds hallucination + slot-capture) — both are judge-strict and </w:t>
       </w:r>
       <w:r>
         <w:rPr>

</xml_diff>